<commit_message>
Make heading numbering an opt-in export setting
Both templates numbered headings in Typst and both reference.docx files
numbered Heading 1-4 natively, so a module or page title with a number of
its own came out doubled ("1. 1. Je eerste website", "5. 5a. CSS"), and a
--flagged export, which drops subfolder headings, numbered items
"1.0.1.".

export.number_headings in course.config.yml, off by default, makes the
exporter pass pandoc --number-sections for both formats: pandoc writes
the numbers into DOCX headings itself and hands the Typst template a
section-numbering pattern. The native numPr is stripped from the shipped
reference.docx files; a forked style keeps its own copy and needs the
same, or its DOCX doubles again once the key is on.

--var section-numbering=1.1. still numbers one PDF run with a pattern of
its own.

Co-Authored-By: Claude Fable 5.1 <noreply@anthropic.com>
</commit_message>
<xml_diff>
--- a/export-styles/generic/reference.docx
+++ b/export-styles/generic/reference.docx
@@ -746,10 +746,6 @@
       <w:keepNext/>
       <w:keepLines/>
       <w:pageBreakBefore/>
-      <w:numPr>
-        <w:ilvl w:val="0"/>
-        <w:numId w:val="900"/>
-      </w:numPr>
       <w:spacing w:before="720" w:after="480"/>
       <w:outlineLvl w:val="0"/>
     </w:pPr>
@@ -771,10 +767,6 @@
     <w:pPr>
       <w:keepNext/>
       <w:keepLines/>
-      <w:numPr>
-        <w:ilvl w:val="1"/>
-        <w:numId w:val="900"/>
-      </w:numPr>
       <w:spacing w:before="240" w:after="240"/>
       <w:outlineLvl w:val="1"/>
     </w:pPr>
@@ -796,10 +788,6 @@
     <w:pPr>
       <w:keepNext/>
       <w:keepLines/>
-      <w:numPr>
-        <w:ilvl w:val="2"/>
-        <w:numId w:val="900"/>
-      </w:numPr>
       <w:spacing w:before="360" w:after="240"/>
       <w:outlineLvl w:val="2"/>
     </w:pPr>
@@ -821,10 +809,6 @@
     <w:pPr>
       <w:keepNext/>
       <w:keepLines/>
-      <w:numPr>
-        <w:ilvl w:val="3"/>
-        <w:numId w:val="900"/>
-      </w:numPr>
       <w:spacing w:before="360" w:after="240"/>
       <w:outlineLvl w:val="3"/>
     </w:pPr>

</xml_diff>